<commit_message>
S04: entregable con dataset de negocio nuevo (insurance.csv), distinto al que resuelve el notebook
</commit_message>
<xml_diff>
--- a/pregrado/s04/plantillas/checklist_diagnostico_regresion.docx
+++ b/pregrado/s04/plantillas/checklist_diagnostico_regresion.docx
@@ -177,40 +177,63 @@
               <w:spacing w:after="0"/>
               <w:jc w:val="center"/>
             </w:pPr>
-            <w:r>
-              <w:drawing>
-                <wp:inline xmlns:a="http://schemas.openxmlformats.org/drawingml/2006/main" xmlns:pic="http://schemas.openxmlformats.org/drawingml/2006/picture">
-                  <wp:extent cx="2074025" cy="369916"/>
-                  <wp:docPr id="1" name="Picture 1"/>
-                  <wp:cNvGraphicFramePr>
-                    <a:graphicFrameLocks noChangeAspect="1"/>
-                  </wp:cNvGraphicFramePr>
-                  <a:graphic>
-                    <a:graphicData uri="http://schemas.openxmlformats.org/drawingml/2006/picture">
-                      <pic:pic>
-                        <pic:nvPicPr>
-                          <pic:cNvPr id="0" name="eq_fb62fe159aed.png"/>
-                          <pic:cNvPicPr/>
-                        </pic:nvPicPr>
-                        <pic:blipFill>
-                          <a:blip r:embed="rId9"/>
-                          <a:stretch>
-                            <a:fillRect/>
-                          </a:stretch>
-                        </pic:blipFill>
-                        <pic:spPr>
-                          <a:xfrm>
-                            <a:off x="0" y="0"/>
-                            <a:ext cx="2074025" cy="369916"/>
-                          </a:xfrm>
-                          <a:prstGeom prst="rect"/>
-                        </pic:spPr>
-                      </pic:pic>
-                    </a:graphicData>
-                  </a:graphic>
-                </wp:inline>
-              </w:drawing>
-            </w:r>
+            <m:oMath>
+              <m:acc>
+                <m:accPr>
+                  <m:chr m:val="̂"/>
+                </m:accPr>
+                <m:e>
+                  <m:r>
+                    <m:t>β</m:t>
+                  </m:r>
+                </m:e>
+              </m:acc>
+              <m:r>
+                <m:t>=(</m:t>
+              </m:r>
+              <m:sSup>
+                <m:e>
+                  <m:r>
+                    <m:t>X</m:t>
+                  </m:r>
+                </m:e>
+                <m:sup>
+                  <m:r>
+                    <m:t>⊤</m:t>
+                  </m:r>
+                </m:sup>
+              </m:sSup>
+              <m:r>
+                <m:t>X</m:t>
+              </m:r>
+              <m:sSup>
+                <m:e>
+                  <m:r>
+                    <m:t>)</m:t>
+                  </m:r>
+                </m:e>
+                <m:sup>
+                  <m:r>
+                    <m:t>−1</m:t>
+                  </m:r>
+                </m:sup>
+              </m:sSup>
+              <m:sSup>
+                <m:e>
+                  <m:r>
+                    <m:t>X</m:t>
+                  </m:r>
+                </m:e>
+                <m:sup>
+                  <m:r>
+                    <m:t>⊤</m:t>
+                  </m:r>
+                </m:sup>
+              </m:sSup>
+              <m:r>
+                <m:t>y(1)</m:t>
+              </m:r>
+            </m:oMath>
           </w:p>
         </w:tc>
         <w:tc>
@@ -261,40 +284,23 @@
       <w:r>
         <w:t xml:space="preserve"> (Best Linear Unbiased Estimator) bajo esos supuestos y exige que </w:t>
       </w:r>
-      <w:r>
-        <w:drawing>
-          <wp:inline xmlns:a="http://schemas.openxmlformats.org/drawingml/2006/main" xmlns:pic="http://schemas.openxmlformats.org/drawingml/2006/picture">
-            <wp:extent cx="352022" cy="206692"/>
-            <wp:docPr id="2" name="Picture 2"/>
-            <wp:cNvGraphicFramePr>
-              <a:graphicFrameLocks noChangeAspect="1"/>
-            </wp:cNvGraphicFramePr>
-            <a:graphic>
-              <a:graphicData uri="http://schemas.openxmlformats.org/drawingml/2006/picture">
-                <pic:pic>
-                  <pic:nvPicPr>
-                    <pic:cNvPr id="0" name="eq_80ce1f127f7e.png"/>
-                    <pic:cNvPicPr/>
-                  </pic:nvPicPr>
-                  <pic:blipFill>
-                    <a:blip r:embed="rId10"/>
-                    <a:stretch>
-                      <a:fillRect/>
-                    </a:stretch>
-                  </pic:blipFill>
-                  <pic:spPr>
-                    <a:xfrm>
-                      <a:off x="0" y="0"/>
-                      <a:ext cx="352022" cy="206692"/>
-                    </a:xfrm>
-                    <a:prstGeom prst="rect"/>
-                  </pic:spPr>
-                </pic:pic>
-              </a:graphicData>
-            </a:graphic>
-          </wp:inline>
-        </w:drawing>
-      </w:r>
+      <m:oMath>
+        <m:sSup>
+          <m:e>
+            <m:r>
+              <m:t>X</m:t>
+            </m:r>
+          </m:e>
+          <m:sup>
+            <m:r>
+              <m:t>⊤</m:t>
+            </m:r>
+          </m:sup>
+        </m:sSup>
+        <m:r>
+          <m:t>X</m:t>
+        </m:r>
+      </m:oMath>
       <w:r>
         <w:t xml:space="preserve"> sea invertible; si dos predictores son colineales perfectos (la dummy redundante) la inversa no existe y el modelo no se estima —el caso extremo de la multicolinealidad del bloque 2—. Un R² alto no garantiza nada de esto: dos modelos con idéntico ajuste pueden esconder heterocedasticidad, colinealidad u observaciones que distorsionan todos los coeficientes. Por eso, antes de interpretar coeficientes o reportar p-valores, se recorre esta lista de siete bloques de diagnóstico. Cada bloque tiene un criterio numérico o gráfico y una acción concreta si falla. El objetivo no es descartar el modelo, sino </w:t>
       </w:r>
@@ -2175,40 +2181,61 @@
               <w:spacing w:after="0"/>
               <w:jc w:val="center"/>
             </w:pPr>
-            <w:r>
-              <w:drawing>
-                <wp:inline xmlns:a="http://schemas.openxmlformats.org/drawingml/2006/main" xmlns:pic="http://schemas.openxmlformats.org/drawingml/2006/picture">
-                  <wp:extent cx="1458883" cy="440574"/>
-                  <wp:docPr id="3" name="Picture 3"/>
-                  <wp:cNvGraphicFramePr>
-                    <a:graphicFrameLocks noChangeAspect="1"/>
-                  </wp:cNvGraphicFramePr>
-                  <a:graphic>
-                    <a:graphicData uri="http://schemas.openxmlformats.org/drawingml/2006/picture">
-                      <pic:pic>
-                        <pic:nvPicPr>
-                          <pic:cNvPr id="0" name="eq_a45355fc26ec.png"/>
-                          <pic:cNvPicPr/>
-                        </pic:nvPicPr>
-                        <pic:blipFill>
-                          <a:blip r:embed="rId11"/>
-                          <a:stretch>
-                            <a:fillRect/>
-                          </a:stretch>
-                        </pic:blipFill>
-                        <pic:spPr>
-                          <a:xfrm>
-                            <a:off x="0" y="0"/>
-                            <a:ext cx="1458883" cy="440574"/>
-                          </a:xfrm>
-                          <a:prstGeom prst="rect"/>
-                        </pic:spPr>
-                      </pic:pic>
-                    </a:graphicData>
-                  </a:graphic>
-                </wp:inline>
-              </w:drawing>
-            </w:r>
+            <m:oMath>
+              <m:sSub>
+                <m:e>
+                  <m:r>
+                    <m:rPr>
+                      <m:sty m:val="p"/>
+                    </m:rPr>
+                    <m:t>VIF</m:t>
+                  </m:r>
+                </m:e>
+                <m:sub>
+                  <m:r>
+                    <m:t>j</m:t>
+                  </m:r>
+                </m:sub>
+              </m:sSub>
+              <m:r>
+                <m:t>=</m:t>
+              </m:r>
+              <m:f>
+                <m:fPr>
+                  <m:type m:val="bar"/>
+                </m:fPr>
+                <m:num>
+                  <m:r>
+                    <m:t>1</m:t>
+                  </m:r>
+                </m:num>
+                <m:den>
+                  <m:r>
+                    <m:t>1−</m:t>
+                  </m:r>
+                  <m:sSubSup>
+                    <m:e>
+                      <m:r>
+                        <m:t>R</m:t>
+                      </m:r>
+                    </m:e>
+                    <m:sub>
+                      <m:r>
+                        <m:t>j</m:t>
+                      </m:r>
+                    </m:sub>
+                    <m:sup>
+                      <m:r>
+                        <m:t>2</m:t>
+                      </m:r>
+                    </m:sup>
+                  </m:sSubSup>
+                </m:den>
+              </m:f>
+              <m:r>
+                <m:t>(2)</m:t>
+              </m:r>
+            </m:oMath>
           </w:p>
         </w:tc>
         <w:tc>
@@ -2266,77 +2293,39 @@
       <w:r>
         <w:t xml:space="preserve"> el VIF de cada predictor real; en (2), </w:t>
       </w:r>
-      <w:r>
-        <w:drawing>
-          <wp:inline xmlns:a="http://schemas.openxmlformats.org/drawingml/2006/main" xmlns:pic="http://schemas.openxmlformats.org/drawingml/2006/picture">
-            <wp:extent cx="184935" cy="206692"/>
-            <wp:docPr id="4" name="Picture 4"/>
-            <wp:cNvGraphicFramePr>
-              <a:graphicFrameLocks noChangeAspect="1"/>
-            </wp:cNvGraphicFramePr>
-            <a:graphic>
-              <a:graphicData uri="http://schemas.openxmlformats.org/drawingml/2006/picture">
-                <pic:pic>
-                  <pic:nvPicPr>
-                    <pic:cNvPr id="0" name="eq_0c8e2c69efd6.png"/>
-                    <pic:cNvPicPr/>
-                  </pic:nvPicPr>
-                  <pic:blipFill>
-                    <a:blip r:embed="rId12"/>
-                    <a:stretch>
-                      <a:fillRect/>
-                    </a:stretch>
-                  </pic:blipFill>
-                  <pic:spPr>
-                    <a:xfrm>
-                      <a:off x="0" y="0"/>
-                      <a:ext cx="184935" cy="206692"/>
-                    </a:xfrm>
-                    <a:prstGeom prst="rect"/>
-                  </pic:spPr>
-                </pic:pic>
-              </a:graphicData>
-            </a:graphic>
-          </wp:inline>
-        </w:drawing>
-      </w:r>
+      <m:oMath>
+        <m:sSubSup>
+          <m:e>
+            <m:r>
+              <m:t>R</m:t>
+            </m:r>
+          </m:e>
+          <m:sub>
+            <m:r>
+              <m:t>j</m:t>
+            </m:r>
+          </m:sub>
+          <m:sup>
+            <m:r>
+              <m:t>2</m:t>
+            </m:r>
+          </m:sup>
+        </m:sSubSup>
+      </m:oMath>
       <w:r>
         <w:t xml:space="preserve"> es el R² de regresar el predictor j contra todos los demás, de modo que el VIF mide cuántas veces se infla la varianza del coeficiente por la colinealidad (</w:t>
       </w:r>
-      <w:r>
-        <w:drawing>
-          <wp:inline xmlns:a="http://schemas.openxmlformats.org/drawingml/2006/main" xmlns:pic="http://schemas.openxmlformats.org/drawingml/2006/picture">
-            <wp:extent cx="527420" cy="206692"/>
-            <wp:docPr id="5" name="Picture 5"/>
-            <wp:cNvGraphicFramePr>
-              <a:graphicFrameLocks noChangeAspect="1"/>
-            </wp:cNvGraphicFramePr>
-            <a:graphic>
-              <a:graphicData uri="http://schemas.openxmlformats.org/drawingml/2006/picture">
-                <pic:pic>
-                  <pic:nvPicPr>
-                    <pic:cNvPr id="0" name="eq_1897463b7814.png"/>
-                    <pic:cNvPicPr/>
-                  </pic:nvPicPr>
-                  <pic:blipFill>
-                    <a:blip r:embed="rId13"/>
-                    <a:stretch>
-                      <a:fillRect/>
-                    </a:stretch>
-                  </pic:blipFill>
-                  <pic:spPr>
-                    <a:xfrm>
-                      <a:off x="0" y="0"/>
-                      <a:ext cx="527420" cy="206692"/>
-                    </a:xfrm>
-                    <a:prstGeom prst="rect"/>
-                  </pic:spPr>
-                </pic:pic>
-              </a:graphicData>
-            </a:graphic>
-          </wp:inline>
-        </w:drawing>
-      </w:r>
+      <m:oMath>
+        <m:r>
+          <m:rPr>
+            <m:sty m:val="p"/>
+          </m:rPr>
+          <m:t>VIF</m:t>
+        </m:r>
+        <m:r>
+          <m:t>=1</m:t>
+        </m:r>
+      </m:oMath>
       <w:r>
         <w:t xml:space="preserve"> = sin colinealidad). En el modelo de referencia de la sesión los cinco predictores dieron VIF entre 1.50 y 2.47 (sin problema).</w:t>
       </w:r>
@@ -2645,40 +2634,231 @@
               <w:spacing w:after="0"/>
               <w:jc w:val="center"/>
             </w:pPr>
-            <w:r>
-              <w:drawing>
-                <wp:inline xmlns:a="http://schemas.openxmlformats.org/drawingml/2006/main" xmlns:pic="http://schemas.openxmlformats.org/drawingml/2006/picture">
-                  <wp:extent cx="4912821" cy="623454"/>
-                  <wp:docPr id="6" name="Picture 6"/>
-                  <wp:cNvGraphicFramePr>
-                    <a:graphicFrameLocks noChangeAspect="1"/>
-                  </wp:cNvGraphicFramePr>
-                  <a:graphic>
-                    <a:graphicData uri="http://schemas.openxmlformats.org/drawingml/2006/picture">
-                      <pic:pic>
-                        <pic:nvPicPr>
-                          <pic:cNvPr id="0" name="eq_cc99b04a347a.png"/>
-                          <pic:cNvPicPr/>
-                        </pic:nvPicPr>
-                        <pic:blipFill>
-                          <a:blip r:embed="rId14"/>
-                          <a:stretch>
-                            <a:fillRect/>
-                          </a:stretch>
-                        </pic:blipFill>
-                        <pic:spPr>
-                          <a:xfrm>
-                            <a:off x="0" y="0"/>
-                            <a:ext cx="4912821" cy="623454"/>
-                          </a:xfrm>
-                          <a:prstGeom prst="rect"/>
-                        </pic:spPr>
-                      </pic:pic>
-                    </a:graphicData>
-                  </a:graphic>
-                </wp:inline>
-              </w:drawing>
-            </w:r>
+            <m:oMath>
+              <m:sSub>
+                <m:e>
+                  <m:limUpp>
+                    <m:e>
+                      <m:r>
+                        <m:rPr>
+                          <m:sty m:val="p"/>
+                        </m:rPr>
+                        <m:t>Var</m:t>
+                      </m:r>
+                    </m:e>
+                    <m:lim>
+                      <m:r>
+                        <m:t>^</m:t>
+                      </m:r>
+                    </m:lim>
+                  </m:limUpp>
+                </m:e>
+                <m:sub>
+                  <m:r>
+                    <m:rPr>
+                      <m:sty m:val="p"/>
+                    </m:rPr>
+                    <m:t>HC</m:t>
+                  </m:r>
+                  <m:r>
+                    <m:t>3</m:t>
+                  </m:r>
+                </m:sub>
+              </m:sSub>
+              <m:r>
+                <m:t>(</m:t>
+              </m:r>
+              <m:acc>
+                <m:accPr>
+                  <m:chr m:val="̂"/>
+                </m:accPr>
+                <m:e>
+                  <m:r>
+                    <m:t>β</m:t>
+                  </m:r>
+                </m:e>
+              </m:acc>
+              <m:r>
+                <m:t>)=(</m:t>
+              </m:r>
+              <m:sSup>
+                <m:e>
+                  <m:r>
+                    <m:t>X</m:t>
+                  </m:r>
+                </m:e>
+                <m:sup>
+                  <m:r>
+                    <m:t>⊤</m:t>
+                  </m:r>
+                </m:sup>
+              </m:sSup>
+              <m:r>
+                <m:t>X</m:t>
+              </m:r>
+              <m:sSup>
+                <m:e>
+                  <m:r>
+                    <m:t>)</m:t>
+                  </m:r>
+                </m:e>
+                <m:sup>
+                  <m:r>
+                    <m:t>−1</m:t>
+                  </m:r>
+                </m:sup>
+              </m:sSup>
+              <m:d>
+                <m:dPr>
+                  <m:sepChr m:val=""/>
+                </m:dPr>
+                <m:e>
+                  <m:nary>
+                    <m:naryPr>
+                      <m:chr m:val="∑"/>
+                      <m:limLoc m:val="subSup"/>
+                      <m:grow m:val="1"/>
+                      <m:subHide m:val="off"/>
+                      <m:supHide m:val="off"/>
+                    </m:naryPr>
+                    <m:sub>
+                      <m:r>
+                        <m:t>i=1</m:t>
+                      </m:r>
+                    </m:sub>
+                    <m:sup>
+                      <m:r>
+                        <m:t>n</m:t>
+                      </m:r>
+                    </m:sup>
+                    <m:e>
+                      <m:f>
+                        <m:fPr>
+                          <m:type m:val="bar"/>
+                        </m:fPr>
+                        <m:num>
+                          <m:sSubSup>
+                            <m:e>
+                              <m:r>
+                                <m:t>e</m:t>
+                              </m:r>
+                            </m:e>
+                            <m:sub>
+                              <m:r>
+                                <m:t>i</m:t>
+                              </m:r>
+                            </m:sub>
+                            <m:sup>
+                              <m:r>
+                                <m:t>2</m:t>
+                              </m:r>
+                            </m:sup>
+                          </m:sSubSup>
+                        </m:num>
+                        <m:den>
+                          <m:sSup>
+                            <m:e>
+                              <m:d>
+                                <m:dPr>
+                                  <m:sepChr m:val=""/>
+                                </m:dPr>
+                                <m:e>
+                                  <m:r>
+                                    <m:t>1</m:t>
+                                  </m:r>
+                                  <m:r>
+                                    <m:t>−</m:t>
+                                  </m:r>
+                                  <m:sSub>
+                                    <m:e>
+                                      <m:r>
+                                        <m:t>h</m:t>
+                                      </m:r>
+                                    </m:e>
+                                    <m:sub>
+                                      <m:r>
+                                        <m:t>i</m:t>
+                                      </m:r>
+                                    </m:sub>
+                                  </m:sSub>
+                                </m:e>
+                              </m:d>
+                            </m:e>
+                            <m:sup>
+                              <m:r>
+                                <m:t>2</m:t>
+                              </m:r>
+                            </m:sup>
+                          </m:sSup>
+                        </m:den>
+                      </m:f>
+                    </m:e>
+                  </m:nary>
+                  <m:sSub>
+                    <m:e>
+                      <m:r>
+                        <m:t>x</m:t>
+                      </m:r>
+                    </m:e>
+                    <m:sub>
+                      <m:r>
+                        <m:t>i</m:t>
+                      </m:r>
+                    </m:sub>
+                  </m:sSub>
+                  <m:sSubSup>
+                    <m:e>
+                      <m:r>
+                        <m:t>x</m:t>
+                      </m:r>
+                    </m:e>
+                    <m:sub>
+                      <m:r>
+                        <m:t>i</m:t>
+                      </m:r>
+                    </m:sub>
+                    <m:sup>
+                      <m:r>
+                        <m:t>⊤</m:t>
+                      </m:r>
+                    </m:sup>
+                  </m:sSubSup>
+                </m:e>
+              </m:d>
+              <m:r>
+                <m:t>(</m:t>
+              </m:r>
+              <m:sSup>
+                <m:e>
+                  <m:r>
+                    <m:t>X</m:t>
+                  </m:r>
+                </m:e>
+                <m:sup>
+                  <m:r>
+                    <m:t>⊤</m:t>
+                  </m:r>
+                </m:sup>
+              </m:sSup>
+              <m:r>
+                <m:t>X</m:t>
+              </m:r>
+              <m:sSup>
+                <m:e>
+                  <m:r>
+                    <m:t>)</m:t>
+                  </m:r>
+                </m:e>
+                <m:sup>
+                  <m:r>
+                    <m:t>−1</m:t>
+                  </m:r>
+                </m:sup>
+              </m:sSup>
+              <m:r>
+                <m:t>(3)</m:t>
+              </m:r>
+            </m:oMath>
           </w:p>
         </w:tc>
         <w:tc>
@@ -2815,77 +2995,37 @@
       <w:r>
         <w:t xml:space="preserve">, que reemplaza la matriz de covarianzas clásica por el estimador sándwich robusto (3) (con el residual </w:t>
       </w:r>
-      <w:r>
-        <w:drawing>
-          <wp:inline xmlns:a="http://schemas.openxmlformats.org/drawingml/2006/main" xmlns:pic="http://schemas.openxmlformats.org/drawingml/2006/picture">
-            <wp:extent cx="188874" cy="206692"/>
-            <wp:docPr id="7" name="Picture 7"/>
-            <wp:cNvGraphicFramePr>
-              <a:graphicFrameLocks noChangeAspect="1"/>
-            </wp:cNvGraphicFramePr>
-            <a:graphic>
-              <a:graphicData uri="http://schemas.openxmlformats.org/drawingml/2006/picture">
-                <pic:pic>
-                  <pic:nvPicPr>
-                    <pic:cNvPr id="0" name="eq_c8a397e738d6.png"/>
-                    <pic:cNvPicPr/>
-                  </pic:nvPicPr>
-                  <pic:blipFill>
-                    <a:blip r:embed="rId15"/>
-                    <a:stretch>
-                      <a:fillRect/>
-                    </a:stretch>
-                  </pic:blipFill>
-                  <pic:spPr>
-                    <a:xfrm>
-                      <a:off x="0" y="0"/>
-                      <a:ext cx="188874" cy="206692"/>
-                    </a:xfrm>
-                    <a:prstGeom prst="rect"/>
-                  </pic:spPr>
-                </pic:pic>
-              </a:graphicData>
-            </a:graphic>
-          </wp:inline>
-        </w:drawing>
-      </w:r>
+      <m:oMath>
+        <m:sSub>
+          <m:e>
+            <m:r>
+              <m:t>e</m:t>
+            </m:r>
+          </m:e>
+          <m:sub>
+            <m:r>
+              <m:t>i</m:t>
+            </m:r>
+          </m:sub>
+        </m:sSub>
+      </m:oMath>
       <w:r>
         <w:t xml:space="preserve"> y el apalancamiento </w:t>
       </w:r>
-      <w:r>
-        <w:drawing>
-          <wp:inline xmlns:a="http://schemas.openxmlformats.org/drawingml/2006/main" xmlns:pic="http://schemas.openxmlformats.org/drawingml/2006/picture">
-            <wp:extent cx="192437" cy="206692"/>
-            <wp:docPr id="8" name="Picture 8"/>
-            <wp:cNvGraphicFramePr>
-              <a:graphicFrameLocks noChangeAspect="1"/>
-            </wp:cNvGraphicFramePr>
-            <a:graphic>
-              <a:graphicData uri="http://schemas.openxmlformats.org/drawingml/2006/picture">
-                <pic:pic>
-                  <pic:nvPicPr>
-                    <pic:cNvPr id="0" name="eq_eb0af772b0fd.png"/>
-                    <pic:cNvPicPr/>
-                  </pic:nvPicPr>
-                  <pic:blipFill>
-                    <a:blip r:embed="rId16"/>
-                    <a:stretch>
-                      <a:fillRect/>
-                    </a:stretch>
-                  </pic:blipFill>
-                  <pic:spPr>
-                    <a:xfrm>
-                      <a:off x="0" y="0"/>
-                      <a:ext cx="192437" cy="206692"/>
-                    </a:xfrm>
-                    <a:prstGeom prst="rect"/>
-                  </pic:spPr>
-                </pic:pic>
-              </a:graphicData>
-            </a:graphic>
-          </wp:inline>
-        </w:drawing>
-      </w:r>
+      <m:oMath>
+        <m:sSub>
+          <m:e>
+            <m:r>
+              <m:t>h</m:t>
+            </m:r>
+          </m:e>
+          <m:sub>
+            <m:r>
+              <m:t>i</m:t>
+            </m:r>
+          </m:sub>
+        </m:sSub>
+      </m:oMath>
       <w:r>
         <w:t xml:space="preserve"> de cada observación). Los coeficientes no cambian; sus SE, t y p-valores se vuelven más honestos. En el ejemplo, el SE de </w:t>
       </w:r>
@@ -3676,40 +3816,71 @@
               <w:spacing w:after="0"/>
               <w:jc w:val="center"/>
             </w:pPr>
-            <w:r>
-              <w:drawing>
-                <wp:inline xmlns:a="http://schemas.openxmlformats.org/drawingml/2006/main" xmlns:pic="http://schemas.openxmlformats.org/drawingml/2006/picture">
-                  <wp:extent cx="2855421" cy="295101"/>
-                  <wp:docPr id="9" name="Picture 9"/>
-                  <wp:cNvGraphicFramePr>
-                    <a:graphicFrameLocks noChangeAspect="1"/>
-                  </wp:cNvGraphicFramePr>
-                  <a:graphic>
-                    <a:graphicData uri="http://schemas.openxmlformats.org/drawingml/2006/picture">
-                      <pic:pic>
-                        <pic:nvPicPr>
-                          <pic:cNvPr id="0" name="eq_f9625b3f0d0c.png"/>
-                          <pic:cNvPicPr/>
-                        </pic:nvPicPr>
-                        <pic:blipFill>
-                          <a:blip r:embed="rId17"/>
-                          <a:stretch>
-                            <a:fillRect/>
-                          </a:stretch>
-                        </pic:blipFill>
-                        <pic:spPr>
-                          <a:xfrm>
-                            <a:off x="0" y="0"/>
-                            <a:ext cx="2855421" cy="295101"/>
-                          </a:xfrm>
-                          <a:prstGeom prst="rect"/>
-                        </pic:spPr>
-                      </pic:pic>
-                    </a:graphicData>
-                  </a:graphic>
-                </wp:inline>
-              </w:drawing>
-            </w:r>
+            <m:oMath>
+              <m:r>
+                <m:t>y=</m:t>
+              </m:r>
+              <m:sSub>
+                <m:e>
+                  <m:r>
+                    <m:t>β</m:t>
+                  </m:r>
+                </m:e>
+                <m:sub>
+                  <m:r>
+                    <m:t>0</m:t>
+                  </m:r>
+                </m:sub>
+              </m:sSub>
+              <m:r>
+                <m:t>+</m:t>
+              </m:r>
+              <m:sSub>
+                <m:e>
+                  <m:r>
+                    <m:t>β</m:t>
+                  </m:r>
+                </m:e>
+                <m:sub>
+                  <m:r>
+                    <m:t>1</m:t>
+                  </m:r>
+                </m:sub>
+              </m:sSub>
+              <m:r>
+                <m:t>x+</m:t>
+              </m:r>
+              <m:sSub>
+                <m:e>
+                  <m:r>
+                    <m:t>β</m:t>
+                  </m:r>
+                </m:e>
+                <m:sub>
+                  <m:r>
+                    <m:t>2</m:t>
+                  </m:r>
+                </m:sub>
+              </m:sSub>
+              <m:r>
+                <m:t>z+</m:t>
+              </m:r>
+              <m:sSub>
+                <m:e>
+                  <m:r>
+                    <m:t>β</m:t>
+                  </m:r>
+                </m:e>
+                <m:sub>
+                  <m:r>
+                    <m:t>3</m:t>
+                  </m:r>
+                </m:sub>
+              </m:sSub>
+              <m:r>
+                <m:t>xz(4)</m:t>
+              </m:r>
+            </m:oMath>
           </w:p>
         </w:tc>
         <w:tc>
@@ -3810,40 +3981,56 @@
               <w:spacing w:after="0"/>
               <w:jc w:val="center"/>
             </w:pPr>
-            <w:r>
-              <w:drawing>
-                <wp:inline xmlns:a="http://schemas.openxmlformats.org/drawingml/2006/main" xmlns:pic="http://schemas.openxmlformats.org/drawingml/2006/picture">
-                  <wp:extent cx="1620981" cy="353290"/>
-                  <wp:docPr id="10" name="Picture 10"/>
-                  <wp:cNvGraphicFramePr>
-                    <a:graphicFrameLocks noChangeAspect="1"/>
-                  </wp:cNvGraphicFramePr>
-                  <a:graphic>
-                    <a:graphicData uri="http://schemas.openxmlformats.org/drawingml/2006/picture">
-                      <pic:pic>
-                        <pic:nvPicPr>
-                          <pic:cNvPr id="0" name="eq_42f9c0f2115b.png"/>
-                          <pic:cNvPicPr/>
-                        </pic:nvPicPr>
-                        <pic:blipFill>
-                          <a:blip r:embed="rId18"/>
-                          <a:stretch>
-                            <a:fillRect/>
-                          </a:stretch>
-                        </pic:blipFill>
-                        <pic:spPr>
-                          <a:xfrm>
-                            <a:off x="0" y="0"/>
-                            <a:ext cx="1620981" cy="353290"/>
-                          </a:xfrm>
-                          <a:prstGeom prst="rect"/>
-                        </pic:spPr>
-                      </pic:pic>
-                    </a:graphicData>
-                  </a:graphic>
-                </wp:inline>
-              </w:drawing>
-            </w:r>
+            <m:oMath>
+              <m:f>
+                <m:fPr>
+                  <m:type m:val="bar"/>
+                </m:fPr>
+                <m:num>
+                  <m:r>
+                    <m:t>∂y</m:t>
+                  </m:r>
+                </m:num>
+                <m:den>
+                  <m:r>
+                    <m:t>∂x</m:t>
+                  </m:r>
+                </m:den>
+              </m:f>
+              <m:r>
+                <m:t>=</m:t>
+              </m:r>
+              <m:sSub>
+                <m:e>
+                  <m:r>
+                    <m:t>β</m:t>
+                  </m:r>
+                </m:e>
+                <m:sub>
+                  <m:r>
+                    <m:t>1</m:t>
+                  </m:r>
+                </m:sub>
+              </m:sSub>
+              <m:r>
+                <m:t>+</m:t>
+              </m:r>
+              <m:sSub>
+                <m:e>
+                  <m:r>
+                    <m:t>β</m:t>
+                  </m:r>
+                </m:e>
+                <m:sub>
+                  <m:r>
+                    <m:t>3</m:t>
+                  </m:r>
+                </m:sub>
+              </m:sSub>
+              <m:r>
+                <m:t>z(5)</m:t>
+              </m:r>
+            </m:oMath>
           </w:p>
         </w:tc>
         <w:tc>
@@ -3885,40 +4072,20 @@
       <w:r>
         <w:t xml:space="preserve">Por eso, con interacción (4), el coeficiente principal </w:t>
       </w:r>
-      <w:r>
-        <w:drawing>
-          <wp:inline xmlns:a="http://schemas.openxmlformats.org/drawingml/2006/main" xmlns:pic="http://schemas.openxmlformats.org/drawingml/2006/picture">
-            <wp:extent cx="220705" cy="206692"/>
-            <wp:docPr id="11" name="Picture 11"/>
-            <wp:cNvGraphicFramePr>
-              <a:graphicFrameLocks noChangeAspect="1"/>
-            </wp:cNvGraphicFramePr>
-            <a:graphic>
-              <a:graphicData uri="http://schemas.openxmlformats.org/drawingml/2006/picture">
-                <pic:pic>
-                  <pic:nvPicPr>
-                    <pic:cNvPr id="0" name="eq_c48ee430094c.png"/>
-                    <pic:cNvPicPr/>
-                  </pic:nvPicPr>
-                  <pic:blipFill>
-                    <a:blip r:embed="rId19"/>
-                    <a:stretch>
-                      <a:fillRect/>
-                    </a:stretch>
-                  </pic:blipFill>
-                  <pic:spPr>
-                    <a:xfrm>
-                      <a:off x="0" y="0"/>
-                      <a:ext cx="220705" cy="206692"/>
-                    </a:xfrm>
-                    <a:prstGeom prst="rect"/>
-                  </pic:spPr>
-                </pic:pic>
-              </a:graphicData>
-            </a:graphic>
-          </wp:inline>
-        </w:drawing>
-      </w:r>
+      <m:oMath>
+        <m:sSub>
+          <m:e>
+            <m:r>
+              <m:t>β</m:t>
+            </m:r>
+          </m:e>
+          <m:sub>
+            <m:r>
+              <m:t>1</m:t>
+            </m:r>
+          </m:sub>
+        </m:sSub>
+      </m:oMath>
       <w:r>
         <w:t xml:space="preserve"> es el efecto </w:t>
       </w:r>
@@ -3931,40 +4098,20 @@
       <w:r>
         <w:t xml:space="preserve"> cuando z = 0 (grupo de referencia) y la pendiente efectiva es la de (5); leer </w:t>
       </w:r>
-      <w:r>
-        <w:drawing>
-          <wp:inline xmlns:a="http://schemas.openxmlformats.org/drawingml/2006/main" xmlns:pic="http://schemas.openxmlformats.org/drawingml/2006/picture">
-            <wp:extent cx="220705" cy="206692"/>
-            <wp:docPr id="12" name="Picture 12"/>
-            <wp:cNvGraphicFramePr>
-              <a:graphicFrameLocks noChangeAspect="1"/>
-            </wp:cNvGraphicFramePr>
-            <a:graphic>
-              <a:graphicData uri="http://schemas.openxmlformats.org/drawingml/2006/picture">
-                <pic:pic>
-                  <pic:nvPicPr>
-                    <pic:cNvPr id="0" name="eq_c48ee430094c.png"/>
-                    <pic:cNvPicPr/>
-                  </pic:nvPicPr>
-                  <pic:blipFill>
-                    <a:blip r:embed="rId19"/>
-                    <a:stretch>
-                      <a:fillRect/>
-                    </a:stretch>
-                  </pic:blipFill>
-                  <pic:spPr>
-                    <a:xfrm>
-                      <a:off x="0" y="0"/>
-                      <a:ext cx="220705" cy="206692"/>
-                    </a:xfrm>
-                    <a:prstGeom prst="rect"/>
-                  </pic:spPr>
-                </pic:pic>
-              </a:graphicData>
-            </a:graphic>
-          </wp:inline>
-        </w:drawing>
-      </w:r>
+      <m:oMath>
+        <m:sSub>
+          <m:e>
+            <m:r>
+              <m:t>β</m:t>
+            </m:r>
+          </m:e>
+          <m:sub>
+            <m:r>
+              <m:t>1</m:t>
+            </m:r>
+          </m:sub>
+        </m:sSub>
+      </m:oMath>
       <w:r>
         <w:t xml:space="preserve"> de forma aislada como «el efecto del tamaño» es engañoso.</w:t>
       </w:r>
@@ -4916,43 +5063,23 @@
               </w:rPr>
               <w:t>Colinealidad perfecta al ajustar (</w:t>
             </w:r>
-            <w:r>
-              <w:rPr>
-                <w:sz w:val="19"/>
-              </w:rPr>
-              <w:drawing>
-                <wp:inline xmlns:a="http://schemas.openxmlformats.org/drawingml/2006/main" xmlns:pic="http://schemas.openxmlformats.org/drawingml/2006/picture">
-                  <wp:extent cx="352022" cy="206692"/>
-                  <wp:docPr id="13" name="Picture 13"/>
-                  <wp:cNvGraphicFramePr>
-                    <a:graphicFrameLocks noChangeAspect="1"/>
-                  </wp:cNvGraphicFramePr>
-                  <a:graphic>
-                    <a:graphicData uri="http://schemas.openxmlformats.org/drawingml/2006/picture">
-                      <pic:pic>
-                        <pic:nvPicPr>
-                          <pic:cNvPr id="0" name="eq_80ce1f127f7e.png"/>
-                          <pic:cNvPicPr/>
-                        </pic:nvPicPr>
-                        <pic:blipFill>
-                          <a:blip r:embed="rId10"/>
-                          <a:stretch>
-                            <a:fillRect/>
-                          </a:stretch>
-                        </pic:blipFill>
-                        <pic:spPr>
-                          <a:xfrm>
-                            <a:off x="0" y="0"/>
-                            <a:ext cx="352022" cy="206692"/>
-                          </a:xfrm>
-                          <a:prstGeom prst="rect"/>
-                        </pic:spPr>
-                      </pic:pic>
-                    </a:graphicData>
-                  </a:graphic>
-                </wp:inline>
-              </w:drawing>
-            </w:r>
+            <m:oMath>
+              <m:sSup>
+                <m:e>
+                  <m:r>
+                    <m:t>X</m:t>
+                  </m:r>
+                </m:e>
+                <m:sup>
+                  <m:r>
+                    <m:t>⊤</m:t>
+                  </m:r>
+                </m:sup>
+              </m:sSup>
+              <m:r>
+                <m:t>X</m:t>
+              </m:r>
+            </m:oMath>
             <w:r>
               <w:rPr>
                 <w:sz w:val="19"/>
@@ -5130,43 +5257,20 @@
               </w:rPr>
               <w:t xml:space="preserve"> (los términos principales); leer (5), no </w:t>
             </w:r>
-            <w:r>
-              <w:rPr>
-                <w:sz w:val="19"/>
-              </w:rPr>
-              <w:drawing>
-                <wp:inline xmlns:a="http://schemas.openxmlformats.org/drawingml/2006/main" xmlns:pic="http://schemas.openxmlformats.org/drawingml/2006/picture">
-                  <wp:extent cx="220705" cy="206692"/>
-                  <wp:docPr id="14" name="Picture 14"/>
-                  <wp:cNvGraphicFramePr>
-                    <a:graphicFrameLocks noChangeAspect="1"/>
-                  </wp:cNvGraphicFramePr>
-                  <a:graphic>
-                    <a:graphicData uri="http://schemas.openxmlformats.org/drawingml/2006/picture">
-                      <pic:pic>
-                        <pic:nvPicPr>
-                          <pic:cNvPr id="0" name="eq_c48ee430094c.png"/>
-                          <pic:cNvPicPr/>
-                        </pic:nvPicPr>
-                        <pic:blipFill>
-                          <a:blip r:embed="rId19"/>
-                          <a:stretch>
-                            <a:fillRect/>
-                          </a:stretch>
-                        </pic:blipFill>
-                        <pic:spPr>
-                          <a:xfrm>
-                            <a:off x="0" y="0"/>
-                            <a:ext cx="220705" cy="206692"/>
-                          </a:xfrm>
-                          <a:prstGeom prst="rect"/>
-                        </pic:spPr>
-                      </pic:pic>
-                    </a:graphicData>
-                  </a:graphic>
-                </wp:inline>
-              </w:drawing>
-            </w:r>
+            <m:oMath>
+              <m:sSub>
+                <m:e>
+                  <m:r>
+                    <m:t>β</m:t>
+                  </m:r>
+                </m:e>
+                <m:sub>
+                  <m:r>
+                    <m:t>1</m:t>
+                  </m:r>
+                </m:sub>
+              </m:sSub>
+            </m:oMath>
             <w:r>
               <w:rPr>
                 <w:sz w:val="19"/>
@@ -5483,40 +5587,38 @@
       <w:r>
         <w:t xml:space="preserve"> de x como constante (la pendiente efectiva es la de (5), </w:t>
       </w:r>
-      <w:r>
-        <w:drawing>
-          <wp:inline xmlns:a="http://schemas.openxmlformats.org/drawingml/2006/main" xmlns:pic="http://schemas.openxmlformats.org/drawingml/2006/picture">
-            <wp:extent cx="588548" cy="206692"/>
-            <wp:docPr id="15" name="Picture 15"/>
-            <wp:cNvGraphicFramePr>
-              <a:graphicFrameLocks noChangeAspect="1"/>
-            </wp:cNvGraphicFramePr>
-            <a:graphic>
-              <a:graphicData uri="http://schemas.openxmlformats.org/drawingml/2006/picture">
-                <pic:pic>
-                  <pic:nvPicPr>
-                    <pic:cNvPr id="0" name="eq_6f5ca2341c07.png"/>
-                    <pic:cNvPicPr/>
-                  </pic:nvPicPr>
-                  <pic:blipFill>
-                    <a:blip r:embed="rId20"/>
-                    <a:stretch>
-                      <a:fillRect/>
-                    </a:stretch>
-                  </pic:blipFill>
-                  <pic:spPr>
-                    <a:xfrm>
-                      <a:off x="0" y="0"/>
-                      <a:ext cx="588548" cy="206692"/>
-                    </a:xfrm>
-                    <a:prstGeom prst="rect"/>
-                  </pic:spPr>
-                </pic:pic>
-              </a:graphicData>
-            </a:graphic>
-          </wp:inline>
-        </w:drawing>
-      </w:r>
+      <m:oMath>
+        <m:sSub>
+          <m:e>
+            <m:r>
+              <m:t>β</m:t>
+            </m:r>
+          </m:e>
+          <m:sub>
+            <m:r>
+              <m:t>1</m:t>
+            </m:r>
+          </m:sub>
+        </m:sSub>
+        <m:r>
+          <m:t>+</m:t>
+        </m:r>
+        <m:sSub>
+          <m:e>
+            <m:r>
+              <m:t>β</m:t>
+            </m:r>
+          </m:e>
+          <m:sub>
+            <m:r>
+              <m:t>3</m:t>
+            </m:r>
+          </m:sub>
+        </m:sSub>
+        <m:r>
+          <m:t>z</m:t>
+        </m:r>
+      </m:oMath>
       <w:r>
         <w:t>).</w:t>
       </w:r>
@@ -5687,8 +5789,8 @@
       </w:r>
     </w:p>
     <w:sectPr>
-      <w:headerReference w:type="default" r:id="rId21"/>
-      <w:footerReference w:type="default" r:id="rId22"/>
+      <w:headerReference w:type="default" r:id="rId9"/>
+      <w:footerReference w:type="default" r:id="rId10"/>
       <w:pgSz w:w="12240" w:h="15840"/>
       <w:pgMar w:top="1134" w:right="1247" w:bottom="1020" w:left="1247" w:header="720" w:footer="720" w:gutter="0"/>
       <w:cols w:space="720"/>

</xml_diff>